<commit_message>
docs(selfact): le .docx du whitepaper reprend le texte corrigé le 27/09
Régénéré par scripts/whitepaper-docx.sh depuis le .md. Le .docx datait du
02/09 et promettait encore « compliant legal documents, one analysis away »
et « No cloud. No third party. No legal fee. », là où le .md décrit depuis le
27/09 ce que SelfAct fait : la ressource officielle, le délai, un modèle à
compléter. 19 paragraphes changent ; métadonnées Office réécrites par le
script, auteur tel que le déclare l'en-tête du .md.

Co-Authored-By: Claude Opus 5.5 <noreply@anthropic.com>
</commit_message>
<xml_diff>
--- a/self-right/selfact/docs/whitepaper.docx
+++ b/self-right/selfact/docs/whitepaper.docx
@@ -51,37 +51,55 @@
         <w:t xml:space="preserve"> </w:t>
       </w:r>
       <w:r>
-        <w:t xml:space="preserve">compliant</w:t>
-      </w:r>
-      <w:r>
-        <w:t xml:space="preserve"> </w:t>
-      </w:r>
-      <w:r>
-        <w:t xml:space="preserve">legal</w:t>
-      </w:r>
-      <w:r>
-        <w:t xml:space="preserve"> </w:t>
-      </w:r>
-      <w:r>
-        <w:t xml:space="preserve">documents,</w:t>
-      </w:r>
-      <w:r>
-        <w:t xml:space="preserve"> </w:t>
-      </w:r>
-      <w:r>
-        <w:t xml:space="preserve">one</w:t>
-      </w:r>
-      <w:r>
-        <w:t xml:space="preserve"> </w:t>
-      </w:r>
-      <w:r>
-        <w:t xml:space="preserve">analysis</w:t>
-      </w:r>
-      <w:r>
-        <w:t xml:space="preserve"> </w:t>
-      </w:r>
-      <w:r>
-        <w:t xml:space="preserve">away</w:t>
+        <w:t xml:space="preserve">the</w:t>
+      </w:r>
+      <w:r>
+        <w:t xml:space="preserve"> </w:t>
+      </w:r>
+      <w:r>
+        <w:t xml:space="preserve">official</w:t>
+      </w:r>
+      <w:r>
+        <w:t xml:space="preserve"> </w:t>
+      </w:r>
+      <w:r>
+        <w:t xml:space="preserve">resource,</w:t>
+      </w:r>
+      <w:r>
+        <w:t xml:space="preserve"> </w:t>
+      </w:r>
+      <w:r>
+        <w:t xml:space="preserve">the</w:t>
+      </w:r>
+      <w:r>
+        <w:t xml:space="preserve"> </w:t>
+      </w:r>
+      <w:r>
+        <w:t xml:space="preserve">deadline,</w:t>
+      </w:r>
+      <w:r>
+        <w:t xml:space="preserve"> </w:t>
+      </w:r>
+      <w:r>
+        <w:t xml:space="preserve">a</w:t>
+      </w:r>
+      <w:r>
+        <w:t xml:space="preserve"> </w:t>
+      </w:r>
+      <w:r>
+        <w:t xml:space="preserve">template</w:t>
+      </w:r>
+      <w:r>
+        <w:t xml:space="preserve"> </w:t>
+      </w:r>
+      <w:r>
+        <w:t xml:space="preserve">to</w:t>
+      </w:r>
+      <w:r>
+        <w:t xml:space="preserve"> </w:t>
+      </w:r>
+      <w:r>
+        <w:t xml:space="preserve">complete</w:t>
       </w:r>
     </w:p>
     <w:p>
@@ -155,64 +173,7 @@
         <w:t xml:space="preserve"> </w:t>
       </w:r>
       <w:r>
-        <w:t xml:space="preserve">that closes the gap between</w:t>
-      </w:r>
-      <w:r>
-        <w:t xml:space="preserve"> </w:t>
-      </w:r>
-      <w:r>
-        <w:rPr>
-          <w:i/>
-          <w:iCs/>
-        </w:rPr>
-        <w:t xml:space="preserve">“</w:t>
-      </w:r>
-      <w:r>
-        <w:rPr>
-          <w:i/>
-          <w:iCs/>
-        </w:rPr>
-        <w:t xml:space="preserve">you understand your rights</w:t>
-      </w:r>
-      <w:r>
-        <w:rPr>
-          <w:i/>
-          <w:iCs/>
-        </w:rPr>
-        <w:t xml:space="preserve">”</w:t>
-      </w:r>
-      <w:r>
-        <w:t xml:space="preserve"> </w:t>
-      </w:r>
-      <w:r>
-        <w:t xml:space="preserve">and</w:t>
-      </w:r>
-      <w:r>
-        <w:t xml:space="preserve"> </w:t>
-      </w:r>
-      <w:r>
-        <w:rPr>
-          <w:i/>
-          <w:iCs/>
-        </w:rPr>
-        <w:t xml:space="preserve">“</w:t>
-      </w:r>
-      <w:r>
-        <w:rPr>
-          <w:i/>
-          <w:iCs/>
-        </w:rPr>
-        <w:t xml:space="preserve">your formal notice is signed and sent</w:t>
-      </w:r>
-      <w:r>
-        <w:rPr>
-          <w:i/>
-          <w:iCs/>
-        </w:rPr>
-        <w:t xml:space="preserve">”</w:t>
-      </w:r>
-      <w:r>
-        <w:t xml:space="preserve">. It takes the structured JSON output of a SelfJustice analysis and turns it into the documents a dispute needs: a mise en demeure, a saisine, and the procedural deadline that governs both.</w:t>
+        <w:t xml:space="preserve">for the step that follows the law: which form, which online service, which deadline, which letter. For a situation, it points to the official resource, computes the procedural deadline, and gives letter templates with gaps that the reader completes in their browser. It does not analyse a case: legal advice is reserved to legal professionals in France (loi n° 71-1130).</w:t>
       </w:r>
     </w:p>
     <w:p>
@@ -220,7 +181,7 @@
         <w:pStyle w:val="BodyText"/>
       </w:pPr>
       <w:r>
-        <w:t xml:space="preserve">No cloud. No third party. No legal fee. The tool runs locally, the documents are yours, and the deadlines land in your calendar.</w:t>
+        <w:t xml:space="preserve">Free of charge. What the reader types into a template stays in their browser — the server refuses to receive a document — and the deadlines land in their calendar.</w:t>
       </w:r>
     </w:p>
     <w:bookmarkEnd w:id="21"/>
@@ -290,7 +251,7 @@
         <w:pStyle w:val="FirstParagraph"/>
       </w:pPr>
       <w:r>
-        <w:t xml:space="preserve">SelfAct is a</w:t>
+        <w:t xml:space="preserve">SelfAct is driven by</w:t>
       </w:r>
       <w:r>
         <w:t xml:space="preserve"> </w:t>
@@ -300,13 +261,10 @@
           <w:b/>
           <w:bCs/>
         </w:rPr>
-        <w:t xml:space="preserve">template-driven document generator</w:t>
-      </w:r>
-      <w:r>
-        <w:t xml:space="preserve"> </w:t>
-      </w:r>
-      <w:r>
-        <w:t xml:space="preserve">that takes the SelfJustice JSON analysis as input and produces:</w:t>
+        <w:t xml:space="preserve">situations and templates</w:t>
+      </w:r>
+      <w:r>
+        <w:t xml:space="preserve">. For a situation, it provides:</w:t>
       </w:r>
     </w:p>
     <w:p>
@@ -334,7 +292,7 @@
         <w:t xml:space="preserve"> </w:t>
       </w:r>
       <w:r>
-        <w:t xml:space="preserve">carrying the legal basis, the factual summary and the standard 15-day response clause.</w:t>
+        <w:t xml:space="preserve">template with gaps: the facts, the legal basis the reader relies on and the response delay are theirs to fill.</w:t>
       </w:r>
     </w:p>
     <w:p>
@@ -362,7 +320,7 @@
         <w:t xml:space="preserve"> </w:t>
       </w:r>
       <w:r>
-        <w:t xml:space="preserve">of the competent jurisdiction (tribunal judiciaire, tribunal de proximité, conciliateur de justice, médiateur, conseil des prud’hommes) with its list of attachments.</w:t>
+        <w:t xml:space="preserve">template for the conciliateur de justice, and one for the Défenseur des droits.</w:t>
       </w:r>
     </w:p>
     <w:p>
@@ -1655,7 +1613,7 @@
         </w:numPr>
       </w:pPr>
       <w:r>
-        <w:t xml:space="preserve">All input is processed in-memory and written only to the local filesystem.</w:t>
+        <w:t xml:space="preserve">What the reader types into a template is processed in their browser and never sent: the server refuses to receive a document. Catalogue searches and deadline computations are ordinary requests to the server.</w:t>
       </w:r>
     </w:p>
     <w:p>
@@ -1709,7 +1667,7 @@
         <w:pStyle w:val="FirstParagraph"/>
       </w:pPr>
       <w:r>
-        <w:t xml:space="preserve">The two modules share a host and a reading order: SelfJustice says what the law provides, SelfAct says what to send and by when. There is no automatic hand-off between them — a caller reads the SelfJustice answer, picks the situation it describes, and asks SelfAct for the acts.</w:t>
+        <w:t xml:space="preserve">The two modules share a host and a reading order: SelfJustice says what the law provides, SelfAct points to the step and its deadline. There is no automatic hand-off between them — a caller reads the SelfJustice answer, picks the situation it describes, and asks SelfAct for the acts.</w:t>
       </w:r>
     </w:p>
     <w:p>
@@ -1856,7 +1814,7 @@
         <w:pStyle w:val="FirstParagraph"/>
       </w:pPr>
       <w:r>
-        <w:t xml:space="preserve">AGPL-3.0-or-later (since 2026-04-19; earlier releases were MIT and remain so under their original terms). Contributions welcome for: additional templates, additional CERFA, additional jurisdictions (Belgium, Luxembourg, Québec). Legal reviewers welcome — every template should be validated by a lawyer familiar with the domain.</w:t>
+        <w:t xml:space="preserve">AGPL-3.0-or-later (since 2026-04-19; earlier releases were MIT and remain so under their original terms). Contributions welcome for: additional templates, additional catalogue sources, additional jurisdictions (Belgium, Luxembourg, Québec). Legal reviewers welcome — every template should be validated by a lawyer familiar with the domain.</w:t>
       </w:r>
     </w:p>
     <w:bookmarkEnd w:id="32"/>
@@ -1879,18 +1837,6 @@
       </w:pPr>
       <w:r>
         <w:t xml:space="preserve">Art. 640 CPC (computation of delays)</w:t>
-      </w:r>
-    </w:p>
-    <w:p>
-      <w:pPr>
-        <w:pStyle w:val="Compact"/>
-        <w:numPr>
-          <w:ilvl w:val="0"/>
-          <w:numId w:val="1003"/>
-        </w:numPr>
-      </w:pPr>
-      <w:r>
-        <w:t xml:space="preserve">Art. 242 nonies A Annexe II CGI (mandatory mentions)</w:t>
       </w:r>
     </w:p>
     <w:p>

</xml_diff>

<commit_message>
self-right : SelfAct en bêta, couplage par état déclaré, service-public.gouv.fr
- SelfAct reste « bêta » (badge et statut, FR et EN) jusqu'à la publication
  du MCP.
- Les README de Self-Right et de SelfAct disent ce que SelfAct emprunte à
  SelfJustice sur une instance : statistiques, jeton d'alerte, repli sur son
  répertoire d'état.
- service-public.fr redirige vers service-public.gouv.fr (301, chemin
  conservé) : le domaine suit dans les CGU (révisées le 4 octobre 2026), les
  directives, les textes servis, le MCP et les liens ; le whitepaper .docx est
  régénéré. Le tableau des essais passés d'act.php garde son domaine d'alors.
- Le catalogue n'annonce plus un nombre de modèles figé dans copy-prompts.js.

Co-Authored-By: Claude Opus 5.5 <noreply@anthropic.com>
</commit_message>
<xml_diff>
--- a/self-right/selfact/docs/whitepaper.docx
+++ b/self-right/selfact/docs/whitepaper.docx
@@ -442,7 +442,7 @@
         <w:pStyle w:val="FirstParagraph"/>
       </w:pPr>
       <w:r>
-        <w:t xml:space="preserve">The answer carries the acts that situation calls for, official service-public.fr</w:t>
+        <w:t xml:space="preserve">The answer carries the acts that situation calls for, official service-public.gouv.fr</w:t>
       </w:r>
       <w:r>
         <w:t xml:space="preserve"> </w:t>
@@ -1730,7 +1730,7 @@
         <w:t xml:space="preserve"> </w:t>
       </w:r>
       <w:r>
-        <w:t xml:space="preserve">output, and the official catalogue harvested from service-public.fr. The counts move with each harvest;</w:t>
+        <w:t xml:space="preserve">output, and the official catalogue harvested from service-public.gouv.fr. The counts move with each harvest;</w:t>
       </w:r>
       <w:r>
         <w:t xml:space="preserve"> </w:t>

</xml_diff>